<commit_message>
Ch27 round 2: threshold ending on the key; second door; Otto's toe; pane planted; trims
Co-Authored-By: Claude Opus 5.5 <noreply@anthropic.com>
</commit_message>
<xml_diff>
--- a/claude-notes/manuscript-v2/27-without-escort-merged.docx
+++ b/claude-notes/manuscript-v2/27-without-escort-merged.docx
@@ -143,7 +143,7 @@
           <w:i w:val="0"/>
           <w:strike w:val="0"/>
         </w:rPr>
-        <w:t>Sometimes. It heard rock sometimes. Three times in four. Pappy's gauges had taught her that a needle you couldn't trust every time was a needle you couldn't trust, and she'd known it all week. She laid the plate in the box on its bed of rag, buckled the strap, and said nothing, because nothing true about it would help.</w:t>
+        <w:t>Sometimes. It heard rock sometimes. Three times in four. Pappy's gauges had taught her that a needle you couldn't trust every time was a needle you couldn't use, and she'd known it all week. She laid the plate in the box on its bed of rag, buckled the strap, and said nothing, because nothing true about it would help.</w:t>
       </w:r>
     </w:p>
     <w:p>
@@ -163,7 +163,7 @@
           <w:i w:val="0"/>
           <w:strike w:val="0"/>
         </w:rPr>
-        <w:t>On the top row of the near wall, the Hub lift. Two guards at the board. On the next screen, the turbine floor, men a couple of hours from the end of a shift, walking slower than they had at the start of it. Above them, the city's own screens: platforms and stairheads, and in every one a figure in red-black, standing. On one grey picture near the end of the row, the Miner Town gates, and a small figure in a scarf at the edge of them. Ben didn't let himself look at that one.</w:t>
+        <w:t>On the top row of the near wall, the Hub lift. Two guards at the board. On the next screen, the turbine floor, men a couple of hours from the end of a shift, walking slower than they had at the start of it. Above them, the city's own screens: platforms and stairheads, and in every one a figure in red-black, standing. On one grey picture near the end of the row, the Miner Town gates, and a small figure in a scarf at the edge of them. Ben never looked at that one.</w:t>
       </w:r>
     </w:p>
     <w:p>
@@ -333,17 +333,17 @@
           <w:i w:val="0"/>
           <w:strike w:val="0"/>
         </w:rPr>
-        <w:t>"I don't know." He said it plainly, the same voice he'd used to tell her the arm looked heavy. "Something in me says that's where I'm wanted. I've stopped arguing with it. It's usually right, and I'm usually the last to know."</w:t>
-      </w:r>
-    </w:p>
-    <w:p>
-      <w:r>
-        <w:rPr>
-          <w:b w:val="0"/>
-          <w:i w:val="0"/>
-          <w:strike w:val="0"/>
-        </w:rPr>
-        <w:t>The medic opened her mouth, and closed it. Camilla looked at Otto standing in the doorway with his arms loose at his sides, and the room seemed to settle round him a little, the way water settles round a post. She'd seen men argue with Gage and lose. She'd never seen anyone argue with this. There was nothing in it to push on.</w:t>
+        <w:t>"I don't know." He said it plainly, the same voice he'd used to tell her the arm looked heavy. "Something under the floor's been pulling at my toe all day. It pulls that way. I've stopped arguing with it."</w:t>
+      </w:r>
+    </w:p>
+    <w:p>
+      <w:r>
+        <w:rPr>
+          <w:b w:val="0"/>
+          <w:i w:val="0"/>
+          <w:strike w:val="0"/>
+        </w:rPr>
+        <w:t>The medic opened her mouth, and closed it. Camilla looked at Otto standing in the doorway with his arms loose at his sides. She'd seen men argue with Gage and lose. Nobody in the room argued with this. There was nothing in it to push on.</w:t>
       </w:r>
     </w:p>
     <w:p>
@@ -533,7 +533,7 @@
           <w:i w:val="0"/>
           <w:strike w:val="0"/>
         </w:rPr>
-        <w:t>"Closed." He looked down at her fist, and didn't ask. "Sooner than you are ready. I said so in the briefing room. I had assumed, when I said it, that I was describing other people." He nearly smiled. "I was right. I have been right about a great many things in this office. I have never once been glad of it."</w:t>
+        <w:t>"Closed." He looked down at her fist, and didn't ask. "Sooner than you are ready. I said so in the briefing room. I had assumed, when I said it, that I was describing other people." He nearly smiled. "I was right. I have been right about a great many things in this office."</w:t>
       </w:r>
     </w:p>
     <w:p>
@@ -679,7 +679,7 @@
           <w:i w:val="0"/>
           <w:strike w:val="0"/>
         </w:rPr>
-        <w:t>She looked at the glue on his knuckle, and at his left knee, the fatigue paler there than on the right, where he'd been kneeling on stone every night for a week. She didn't believe him. She didn't tell him so. If she argued, he'd have to promise, and then he'd have to break it, and she'd rather he only had to break the first thing.</w:t>
+        <w:t>She looked at the glue on his knuckle, and at his left knee, the fatigues paler there than on the right, where he'd been kneeling on stone every night for a week. She didn't believe him. She didn't tell him so. If she argued, he'd have to promise, and then he'd have to break it, and she'd rather he only had to break the first thing.</w:t>
       </w:r>
     </w:p>
     <w:p>
@@ -729,7 +729,7 @@
           <w:i w:val="0"/>
           <w:strike w:val="0"/>
         </w:rPr>
-        <w:t>It was a plain door at the end of the corridor beneath the archive, older than the chamber, with no plate on it and a shelf beside it at elbow height. Elara unbuckled the strap and laid the terminal on the shelf, and Anandi laid a folded cloth over it, like a cage covered for the night. The pale stripe on Elara's wrist felt the air. Bare again. It was getting to be her skin.</w:t>
+        <w:t>It was a plain door at the end of the corridor beneath the archive, older than the chamber, with no plate on it and a shelf beside it at elbow height. Elara unbuckled the strap and laid the terminal on the shelf, and Anandi laid a folded cloth over it. The pale stripe on Elara's wrist felt the air. Bare again.</w:t>
       </w:r>
     </w:p>
     <w:p>
@@ -899,7 +899,7 @@
           <w:i w:val="0"/>
           <w:strike w:val="0"/>
         </w:rPr>
-        <w:t>The Dhammapala came next, by the same door. White hair. Bare wrist. She walked to her chair like a woman called onto a mat. She didn't look up at the dark glass. Elara's hands found the sill.</w:t>
+        <w:t>The Dhammapala came next, by the same door. White hair. Bare wrist. She walked to her chair. She didn't look up at the dark glass. Elara's hands found the sill.</w:t>
       </w:r>
     </w:p>
     <w:p>
@@ -959,7 +959,7 @@
           <w:i w:val="0"/>
           <w:strike w:val="0"/>
         </w:rPr>
-        <w:t>The soft-faced man drew out the fifth chair.</w:t>
+        <w:t>The soft-faced man drew out the empty chair.</w:t>
       </w:r>
     </w:p>
     <w:p>
@@ -995,7 +995,7 @@
           <w:i w:val="0"/>
           <w:strike w:val="0"/>
         </w:rPr>
-        <w:t xml:space="preserve"> The right-hand edge of a grey wall, a column nobody had asked for, its location field blank. She'd carried that blank out of the chamber like a stone in a shoe. She was sitting in a blank now. She didn't know if they were the same blank. She knew she'd ask.</w:t>
+        <w:t xml:space="preserve"> The right-hand edge of a grey wall, a column nobody had asked for, its location field blank. She'd carried that blank out of the chamber. She was sitting in a blank now. She didn't know if they were the same blank. She knew she'd ask.</w:t>
       </w:r>
     </w:p>
     <w:p>
@@ -1035,7 +1035,7 @@
           <w:i w:val="0"/>
           <w:strike w:val="0"/>
         </w:rPr>
-        <w:t>Drona. The lower stacks, the cellar of shelving under the tower. Then a door at the end of the shelving, which closed behind the Master with a soft sound.</w:t>
+        <w:t>Drona. The lower stacks, the cellar of shelving under the tower. Then a second door at the end of the shelving, plain and unmarked, beside the one that let onto the sky. It closed behind the Master with a soft sound.</w:t>
       </w:r>
     </w:p>
     <w:p>
@@ -1146,23 +1146,7 @@
           <w:i w:val="0"/>
           <w:strike w:val="0"/>
         </w:rPr>
-        <w:t xml:space="preserve">Inside his coat the notebook pressed its corner against his rib each time he breathed in. Somewhere below there was a room that kept its doors told to no one; the Master's </w:t>
-      </w:r>
-      <w:r>
-        <w:rPr>
-          <w:b w:val="0"/>
-          <w:i/>
-          <w:strike w:val="0"/>
-        </w:rPr>
-        <w:t>I did not need to be taken</w:t>
-      </w:r>
-      <w:r>
-        <w:rPr>
-          <w:b w:val="0"/>
-          <w:i w:val="0"/>
-          <w:strike w:val="0"/>
-        </w:rPr>
-        <w:t xml:space="preserve"> had said that much. Someone ought to say the man's name in a room like that. Daren didn't have the name. He had the man's handwriting, and a hole worn through a page by a pencil.</w:t>
+        <w:t>Inside his coat the notebook pressed its corner against his rib each time he breathed in. Somewhere below was the room the Master hadn't needed to be taken to. Someone ought to say the man's name in a room like that. Daren didn't have the name. He had the man's handwriting, and a hole worn through a page by a pencil.</w:t>
       </w:r>
     </w:p>
     <w:p>
@@ -1362,7 +1346,7 @@
           <w:i w:val="0"/>
           <w:strike w:val="0"/>
         </w:rPr>
-        <w:t>High up in the wall of the table room, behind them all, there was a long dark pane of glass. She'd taken it for a mirror. Once, when the lamp swung, she thought she saw a shape behind it. A head. Then the lamp settled and it was glass.</w:t>
+        <w:t>High up in the wall of the table room, behind them all, there was a long dark pane of glass. She'd taken it for a mirror. Once, when the lamp swung, she thought she saw a shape behind it. A head. Then the lamp settled and it was glass. She didn't think the four at the table had either.</w:t>
       </w:r>
     </w:p>
     <w:p>
@@ -1422,7 +1406,7 @@
           <w:i w:val="0"/>
           <w:strike w:val="0"/>
         </w:rPr>
-        <w:t>He was on the stool at her shoulder, his voice gone low and level, the voice he used for the dead in Miner Town and for Otto's gaps. "Board's up."</w:t>
+        <w:t>He was on the stool at her shoulder, his voice gone low and level, the voice he used for the dead in Miner Town and for Otto's gaps. "Shift's turning."</w:t>
       </w:r>
     </w:p>
     <w:p>
@@ -1492,38 +1476,17 @@
           <w:i w:val="0"/>
           <w:strike w:val="0"/>
         </w:rPr>
-        <w:t>On the left wall, at the table, the old man in the gold lifted his head and looked at the door on the far side, the one nobody had opened for him. On the corridor screen beside it, Otto had turned his head and was looking along the curve of the corridor, at nothing the lens could show.</w:t>
-      </w:r>
-    </w:p>
-    <w:p>
-      <w:r>
-        <w:rPr>
-          <w:b w:val="0"/>
-          <w:i w:val="0"/>
-          <w:strike w:val="0"/>
-        </w:rPr>
-        <w:t>Her mouth was already shaping it.</w:t>
-      </w:r>
-    </w:p>
-    <w:p>
-      <w:r>
-        <w:rPr>
-          <w:b w:val="0"/>
-          <w:i/>
-          <w:strike w:val="0"/>
-          <w:color w:val="5C6B7D"/>
-        </w:rPr>
-        <w:t>Feeds.</w:t>
-      </w:r>
-    </w:p>
-    <w:p>
-      <w:r>
-        <w:rPr>
-          <w:b w:val="0"/>
-          <w:i w:val="0"/>
-          <w:strike w:val="0"/>
-        </w:rPr>
-        <w:t>Not yet.</w:t>
+        <w:t>On the left wall, at the table, the old man in the gold sat with his rings in their row and didn't look at the door on the far side, the one nobody had opened for him.</w:t>
+      </w:r>
+    </w:p>
+    <w:p>
+      <w:r>
+        <w:rPr>
+          <w:b w:val="0"/>
+          <w:i w:val="0"/>
+          <w:strike w:val="0"/>
+        </w:rPr>
+        <w:t>Her mouth was already shaping it. The metal hand came down onto the key, a beat late, and didn't press it.</w:t>
       </w:r>
     </w:p>
     <w:sectPr>

</xml_diff>

<commit_message>
Ch27 review round 3: readable held ending, lens line restored, escort beat, stakes, trims; Ch28 Otto head already turned
Co-Authored-By: Claude Opus 5.5 <noreply@anthropic.com>
</commit_message>
<xml_diff>
--- a/claude-notes/manuscript-v2/27-without-escort-merged.docx
+++ b/claude-notes/manuscript-v2/27-without-escort-merged.docx
@@ -143,7 +143,7 @@
           <w:i w:val="0"/>
           <w:strike w:val="0"/>
         </w:rPr>
-        <w:t>Sometimes. It heard rock sometimes. Three times in four. Pappy's gauges had taught her that a needle you couldn't trust every time was a needle you couldn't use, and she'd known it all week. She laid the plate in the box on its bed of rag, buckled the strap, and said nothing, because nothing true about it would help.</w:t>
+        <w:t>Sometimes. It heard rock sometimes. Three times in four. Pappy's gauges had taught her that a needle you couldn't trust every time was a needle you couldn't use, and she'd known it all week. She laid the plate in the box on its bed of rag, buckled the strap, and said nothing.</w:t>
       </w:r>
     </w:p>
     <w:p>
@@ -343,7 +343,7 @@
           <w:i w:val="0"/>
           <w:strike w:val="0"/>
         </w:rPr>
-        <w:t>The medic opened her mouth, and closed it. Camilla looked at Otto standing in the doorway with his arms loose at his sides. She'd seen men argue with Gage and lose. Nobody in the room argued with this. There was nothing in it to push on.</w:t>
+        <w:t>The medic opened her mouth, and closed it. Camilla looked at Otto standing in the doorway with his arms loose at his sides. She'd seen men argue with Gage and lose. Nobody in the room argued with this.</w:t>
       </w:r>
     </w:p>
     <w:p>
@@ -453,7 +453,7 @@
           <w:i w:val="0"/>
           <w:strike w:val="0"/>
         </w:rPr>
-        <w:t>Neither of them said who'd be in the tunnel the water wanted first. He'd known since before the briefing, lying awake counting props. It sat between their two hands and neither of them put a word on it.</w:t>
+        <w:t>Neither of them said that he would be in the tunnel when the water came. He'd known since the briefing, lying awake counting props. It sat between their two hands and neither of them put a word on it.</w:t>
       </w:r>
     </w:p>
     <w:p>
@@ -593,7 +593,7 @@
           <w:i w:val="0"/>
           <w:strike w:val="0"/>
         </w:rPr>
-        <w:t>"She told me at the door of her rooms. I had my coat on." He looked down at his right hand. There was fresh glue on the knuckle, still shining. "</w:t>
+        <w:t>"She told me at the door of her rooms. I had my coat on." He looked down at his right hand. There was fresh glue on the knuckle, still shining. Then, in the Dhammapala's voice, low and even, without mockery: "</w:t>
       </w:r>
       <w:r>
         <w:rPr>
@@ -609,7 +609,7 @@
           <w:i w:val="0"/>
           <w:strike w:val="0"/>
         </w:rPr>
-        <w:t>" He said it in the Dhammapala's voice, low and even, without mockery. "Then she shut the door."</w:t>
+        <w:t>" And in his own: "She shut the door."</w:t>
       </w:r>
     </w:p>
     <w:p>
@@ -679,7 +679,7 @@
           <w:i w:val="0"/>
           <w:strike w:val="0"/>
         </w:rPr>
-        <w:t>She looked at the glue on his knuckle, and at his left knee, the fatigues paler there than on the right, where he'd been kneeling on stone every night for a week. She didn't believe him. She didn't tell him so. If she argued, he'd have to promise, and then he'd have to break it, and she'd rather he only had to break the first thing.</w:t>
+        <w:t>She looked at the glue on his knuckle, and at his left knee, the fatigues paler there than on the right, where he'd been kneeling on stone every night for a week. She didn't believe him. She didn't tell him so.</w:t>
       </w:r>
     </w:p>
     <w:p>
@@ -779,7 +779,17 @@
           <w:i w:val="0"/>
           <w:strike w:val="0"/>
         </w:rPr>
-        <w:t>The driver said nothing. The car moved.</w:t>
+        <w:t>Elara thought of Rohan on the archive steps with his coat on, and said nothing.</w:t>
+      </w:r>
+    </w:p>
+    <w:p>
+      <w:r>
+        <w:rPr>
+          <w:b w:val="0"/>
+          <w:i w:val="0"/>
+          <w:strike w:val="0"/>
+        </w:rPr>
+        <w:t>The driver didn't answer. The car moved.</w:t>
       </w:r>
     </w:p>
     <w:p>
@@ -799,7 +809,7 @@
           <w:i w:val="0"/>
           <w:strike w:val="0"/>
         </w:rPr>
-        <w:t>The lift had no floors marked. A brass plate where the numbers should have been, polished smooth by a century of nobody touching it. It went down long enough that Elara's pulse ran out of meaning and she stopped counting. Her ears popped. The air coming in round the door changed. Warmer. Machine oil, and under it something she couldn't place at first and then could: bread. Somewhere down here someone was baking bread.</w:t>
+        <w:t>The lift had no floors marked. A brass plate where the numbers should have been, gone dull, with nothing on it. It went down long enough that Elara's pulse ran out of meaning and she stopped counting. Her ears popped. The air coming in round the door changed. Warmer. Machine oil, and under it something she couldn't place at first and then could: bread. Somewhere down here someone was baking bread.</w:t>
       </w:r>
     </w:p>
     <w:p>
@@ -1176,7 +1186,7 @@
           <w:i w:val="0"/>
           <w:strike w:val="0"/>
         </w:rPr>
-        <w:t>A man standing alone in a small dark space. Coat done up. Right arm held a little out from the body, the fingers spread. On the wrist something black that drank what light there was. The face above it pale and older than twenty, with a look on it he'd seen on a cat in a mesh carrier, ears flat, body low. The cat had been looking at this. This was what it had seen.</w:t>
+        <w:t>A man standing alone in a small dark space. Coat done up. Right arm held a little out from the body, the fingers spread. On the wrist something black that drank what light there was. The face above it pale and older than twenty, with a look on it he'd seen on a cat in a mesh carrier, ears flat, body low.</w:t>
       </w:r>
     </w:p>
     <w:p>
@@ -1346,7 +1356,7 @@
           <w:i w:val="0"/>
           <w:strike w:val="0"/>
         </w:rPr>
-        <w:t>High up in the wall of the table room, behind them all, there was a long dark pane of glass. She'd taken it for a mirror. Once, when the lamp swung, she thought she saw a shape behind it. A head. Then the lamp settled and it was glass. She didn't think the four at the table had either.</w:t>
+        <w:t>High up in the wall of the table room, behind them all, there was a long dark pane of glass. She'd taken it for a mirror. Once, when the lamp swung, she thought she saw a shape behind it. A head. Then the lamp settled and it was glass. She didn't think the four at the table had noticed it either.</w:t>
       </w:r>
     </w:p>
     <w:p>
@@ -1476,17 +1486,17 @@
           <w:i w:val="0"/>
           <w:strike w:val="0"/>
         </w:rPr>
-        <w:t>On the left wall, at the table, the old man in the gold sat with his rings in their row and didn't look at the door on the far side, the one nobody had opened for him.</w:t>
-      </w:r>
-    </w:p>
-    <w:p>
-      <w:r>
-        <w:rPr>
-          <w:b w:val="0"/>
-          <w:i w:val="0"/>
-          <w:strike w:val="0"/>
-        </w:rPr>
-        <w:t>Her mouth was already shaping it. The metal hand came down onto the key, a beat late, and didn't press it.</w:t>
+        <w:t>On the left wall, at the table, the old man in the gold sat with his rings in their row and didn't look at the door on the far side, the one nobody had opened for him. On the corridor screen below it, Otto had turned his head and was looking along the curve of the corridor, at nothing the lens could show.</w:t>
+      </w:r>
+    </w:p>
+    <w:p>
+      <w:r>
+        <w:rPr>
+          <w:b w:val="0"/>
+          <w:i w:val="0"/>
+          <w:strike w:val="0"/>
+        </w:rPr>
+        <w:t>Her mouth was already shaping it. The metal hand came down onto the key, a beat late, and didn't press it. Ben hadn't said it yet. The hand had known before she did.</w:t>
       </w:r>
     </w:p>
     <w:sectPr>

</xml_diff>